<commit_message>
docs: update all client documents with latest features
- PPTX: updated Fase 1 slide with driver system, incidents, PDF reports,
  exact address collection; updated timeline and requirements slides
- DOCX/PDF proposal: added reports, driver system, and address collection
  to Fase 1 scope; updated budget breakdown
- Technical summary PDF: updated contact flow description to reflect
  exact address collection for route reorganization
</commit_message>
<xml_diff>
--- a/docs/GARYCIO_Propuesta_Presupuesto.docx
+++ b/docs/GARYCIO_Propuesta_Presupuesto.docx
@@ -114,7 +114,7 @@
           <w:rFonts w:ascii="Calibri" w:hAnsi="Calibri"/>
           <w:sz w:val="22"/>
         </w:rPr>
-        <w:t>Desarrollo completo del Bot de WhatsApp con flujos conversacionales, incluyendo sistema de reclamos y avisos automatizados</w:t>
+        <w:t>Desarrollo completo del Bot de WhatsApp con 7 flujos conversacionales, incluyendo reclamos, avisos, alta de donantes y recolección de dirección exacta</w:t>
       </w:r>
     </w:p>
     <w:p>
@@ -127,14 +127,34 @@
           <w:b/>
           <w:sz w:val="22"/>
         </w:rPr>
-        <w:t xml:space="preserve">Optimización de recorridos: </w:t>
+        <w:t xml:space="preserve">Sistema de choferes: </w:t>
       </w:r>
       <w:r>
         <w:rPr>
           <w:rFonts w:ascii="Calibri" w:hAnsi="Calibri"/>
           <w:sz w:val="22"/>
         </w:rPr>
-        <w:t>Algoritmo de optimización de recorridos para rutas de recolección</w:t>
+        <w:t>Interfaz para choferes: registro de litros, bidones, combustible e incidentes con alerta inmediata al CEO</w:t>
+      </w:r>
+    </w:p>
+    <w:p>
+      <w:pPr>
+        <w:pStyle w:val="ListBullet"/>
+      </w:pPr>
+      <w:r>
+        <w:rPr>
+          <w:rFonts w:ascii="Calibri" w:hAnsi="Calibri"/>
+          <w:b/>
+          <w:sz w:val="22"/>
+        </w:rPr>
+        <w:t xml:space="preserve">Reportes PDF: </w:t>
+      </w:r>
+      <w:r>
+        <w:rPr>
+          <w:rFonts w:ascii="Calibri" w:hAnsi="Calibri"/>
+          <w:sz w:val="22"/>
+        </w:rPr>
+        <w:t>Reporte PDF diario automático a las 19:00 hs con gráficos y estadísticas, más opción on-demand</w:t>
       </w:r>
     </w:p>
     <w:p>
@@ -154,7 +174,7 @@
           <w:rFonts w:ascii="Calibri" w:hAnsi="Calibri"/>
           <w:sz w:val="22"/>
         </w:rPr>
-        <w:t>Diseño e implementación de base de datos con migración de datos existentes</w:t>
+        <w:t>Diseño e implementación de base de datos PostgreSQL con 18 tablas y migración de datos</w:t>
       </w:r>
     </w:p>
     <w:p>
@@ -286,7 +306,7 @@
                 <w:b w:val="0"/>
                 <w:sz w:val="20"/>
               </w:rPr>
-              <w:t>Bot WhatsApp (desarrollo + flows + reclamos)</w:t>
+              <w:t>Bot WhatsApp (7 flujos + choferes + incidentes)</w:t>
             </w:r>
           </w:p>
         </w:tc>
@@ -351,28 +371,7 @@
                 <w:b w:val="0"/>
                 <w:sz w:val="20"/>
               </w:rPr>
-              <w:t>Optimización de recorridos</w:t>
-            </w:r>
-          </w:p>
-        </w:tc>
-        <w:tc>
-          <w:tcPr>
-            <w:tcW w:type="dxa" w:w="2551"/>
-            <w:shd w:fill="FFFFFF"/>
-          </w:tcPr>
-          <w:p>
-            <w:pPr>
-              <w:spacing w:before="40" w:after="40"/>
-              <w:jc w:val="center"/>
-            </w:pPr>
-            <w:r/>
-            <w:r>
-              <w:rPr>
-                <w:rFonts w:ascii="Calibri" w:hAnsi="Calibri"/>
-                <w:b w:val="0"/>
-                <w:sz w:val="20"/>
-              </w:rPr>
-              <w:t>500</w:t>
+              <w:t>Reportes PDF diarios + on-demand</w:t>
             </w:r>
           </w:p>
         </w:tc>
@@ -397,6 +396,27 @@
             </w:r>
           </w:p>
         </w:tc>
+        <w:tc>
+          <w:tcPr>
+            <w:tcW w:type="dxa" w:w="2551"/>
+            <w:shd w:fill="FFFFFF"/>
+          </w:tcPr>
+          <w:p>
+            <w:pPr>
+              <w:spacing w:before="40" w:after="40"/>
+              <w:jc w:val="center"/>
+            </w:pPr>
+            <w:r/>
+            <w:r>
+              <w:rPr>
+                <w:rFonts w:ascii="Calibri" w:hAnsi="Calibri"/>
+                <w:b w:val="0"/>
+                <w:sz w:val="20"/>
+              </w:rPr>
+              <w:t>200</w:t>
+            </w:r>
+          </w:p>
+        </w:tc>
       </w:tr>
       <w:tr>
         <w:tc>
@@ -416,7 +436,7 @@
                 <w:b w:val="0"/>
                 <w:sz w:val="20"/>
               </w:rPr>
-              <w:t>Base de datos + migración de datos</w:t>
+              <w:t>Base de datos PostgreSQL + migración</w:t>
             </w:r>
           </w:p>
         </w:tc>
@@ -481,7 +501,7 @@
                 <w:b w:val="0"/>
                 <w:sz w:val="20"/>
               </w:rPr>
-              <w:t>Deploy + configuración servidor</w:t>
+              <w:t>Optimización de recorridos</w:t>
             </w:r>
           </w:p>
         </w:tc>
@@ -502,7 +522,7 @@
                 <w:b w:val="0"/>
                 <w:sz w:val="20"/>
               </w:rPr>
-              <w:t>200</w:t>
+              <w:t>300</w:t>
             </w:r>
           </w:p>
         </w:tc>
@@ -523,7 +543,72 @@
                 <w:b w:val="0"/>
                 <w:sz w:val="20"/>
               </w:rPr>
-              <w:t>100</w:t>
+              <w:t>150</w:t>
+            </w:r>
+          </w:p>
+        </w:tc>
+      </w:tr>
+      <w:tr>
+        <w:tc>
+          <w:tcPr>
+            <w:tcW w:type="dxa" w:w="5669"/>
+            <w:shd w:fill="EBF5FB"/>
+          </w:tcPr>
+          <w:p>
+            <w:pPr>
+              <w:spacing w:before="40" w:after="40"/>
+              <w:jc w:val="left"/>
+            </w:pPr>
+            <w:r/>
+            <w:r>
+              <w:rPr>
+                <w:rFonts w:ascii="Calibri" w:hAnsi="Calibri"/>
+                <w:b w:val="0"/>
+                <w:sz w:val="20"/>
+              </w:rPr>
+              <w:t>Deploy + configuración servidor</w:t>
+            </w:r>
+          </w:p>
+        </w:tc>
+        <w:tc>
+          <w:tcPr>
+            <w:tcW w:type="dxa" w:w="2551"/>
+            <w:shd w:fill="EBF5FB"/>
+          </w:tcPr>
+          <w:p>
+            <w:pPr>
+              <w:spacing w:before="40" w:after="40"/>
+              <w:jc w:val="center"/>
+            </w:pPr>
+            <w:r/>
+            <w:r>
+              <w:rPr>
+                <w:rFonts w:ascii="Calibri" w:hAnsi="Calibri"/>
+                <w:b w:val="0"/>
+                <w:sz w:val="20"/>
+              </w:rPr>
+              <w:t>200</w:t>
+            </w:r>
+          </w:p>
+        </w:tc>
+        <w:tc>
+          <w:tcPr>
+            <w:tcW w:type="dxa" w:w="2551"/>
+            <w:shd w:fill="EBF5FB"/>
+          </w:tcPr>
+          <w:p>
+            <w:pPr>
+              <w:spacing w:before="40" w:after="40"/>
+              <w:jc w:val="center"/>
+            </w:pPr>
+            <w:r/>
+            <w:r>
+              <w:rPr>
+                <w:rFonts w:ascii="Calibri" w:hAnsi="Calibri"/>
+                <w:b w:val="0"/>
+                <w:sz w:val="20"/>
+              </w:rPr>
+              <w:t>50</w:t>
             </w:r>
           </w:p>
         </w:tc>

</xml_diff>

<commit_message>
docs: update proposal and summary per client feedback
- Remove IVA mention from notes
- Change payment to single payment after testing (Phase 1)
- Move route optimization to Phase 2, redistribute budget
- Change "Completado" to "En proceso de producción" in tech summary
- Update cover page status accordingly
</commit_message>
<xml_diff>
--- a/docs/GARYCIO_Propuesta_Presupuesto.docx
+++ b/docs/GARYCIO_Propuesta_Presupuesto.docx
@@ -327,7 +327,7 @@
                 <w:b w:val="0"/>
                 <w:sz w:val="20"/>
               </w:rPr>
-              <w:t>1,200</w:t>
+              <w:t>1,400</w:t>
             </w:r>
           </w:p>
         </w:tc>
@@ -348,7 +348,7 @@
                 <w:b w:val="0"/>
                 <w:sz w:val="20"/>
               </w:rPr>
-              <w:t>700</w:t>
+              <w:t>850</w:t>
             </w:r>
           </w:p>
         </w:tc>
@@ -392,7 +392,7 @@
                 <w:b w:val="0"/>
                 <w:sz w:val="20"/>
               </w:rPr>
-              <w:t>300</w:t>
+              <w:t>350</w:t>
             </w:r>
           </w:p>
         </w:tc>
@@ -501,28 +501,7 @@
                 <w:b w:val="0"/>
                 <w:sz w:val="20"/>
               </w:rPr>
-              <w:t>Optimización de recorridos</w:t>
-            </w:r>
-          </w:p>
-        </w:tc>
-        <w:tc>
-          <w:tcPr>
-            <w:tcW w:type="dxa" w:w="2551"/>
-            <w:shd w:fill="FFFFFF"/>
-          </w:tcPr>
-          <w:p>
-            <w:pPr>
-              <w:spacing w:before="40" w:after="40"/>
-              <w:jc w:val="center"/>
-            </w:pPr>
-            <w:r/>
-            <w:r>
-              <w:rPr>
-                <w:rFonts w:ascii="Calibri" w:hAnsi="Calibri"/>
-                <w:b w:val="0"/>
-                <w:sz w:val="20"/>
-              </w:rPr>
-              <w:t>300</w:t>
+              <w:t>Deploy + configuración servidor</w:t>
             </w:r>
           </w:p>
         </w:tc>
@@ -547,54 +526,10 @@
             </w:r>
           </w:p>
         </w:tc>
-      </w:tr>
-      <w:tr>
-        <w:tc>
-          <w:tcPr>
-            <w:tcW w:type="dxa" w:w="5669"/>
-            <w:shd w:fill="EBF5FB"/>
-          </w:tcPr>
-          <w:p>
-            <w:pPr>
-              <w:spacing w:before="40" w:after="40"/>
-              <w:jc w:val="left"/>
-            </w:pPr>
-            <w:r/>
-            <w:r>
-              <w:rPr>
-                <w:rFonts w:ascii="Calibri" w:hAnsi="Calibri"/>
-                <w:b w:val="0"/>
-                <w:sz w:val="20"/>
-              </w:rPr>
-              <w:t>Deploy + configuración servidor</w:t>
-            </w:r>
-          </w:p>
-        </w:tc>
         <w:tc>
           <w:tcPr>
             <w:tcW w:type="dxa" w:w="2551"/>
-            <w:shd w:fill="EBF5FB"/>
-          </w:tcPr>
-          <w:p>
-            <w:pPr>
-              <w:spacing w:before="40" w:after="40"/>
-              <w:jc w:val="center"/>
-            </w:pPr>
-            <w:r/>
-            <w:r>
-              <w:rPr>
-                <w:rFonts w:ascii="Calibri" w:hAnsi="Calibri"/>
-                <w:b w:val="0"/>
-                <w:sz w:val="20"/>
-              </w:rPr>
-              <w:t>200</w:t>
-            </w:r>
-          </w:p>
-        </w:tc>
-        <w:tc>
-          <w:tcPr>
-            <w:tcW w:type="dxa" w:w="2551"/>
-            <w:shd w:fill="EBF5FB"/>
+            <w:shd w:fill="FFFFFF"/>
           </w:tcPr>
           <w:p>
             <w:pPr>
@@ -771,6 +706,26 @@
           <w:sz w:val="22"/>
         </w:rPr>
         <w:t>Sistema completo de gestión de flota con tracking GPS en tiempo real</w:t>
+      </w:r>
+    </w:p>
+    <w:p>
+      <w:pPr>
+        <w:pStyle w:val="ListBullet"/>
+      </w:pPr>
+      <w:r>
+        <w:rPr>
+          <w:rFonts w:ascii="Calibri" w:hAnsi="Calibri"/>
+          <w:b/>
+          <w:sz w:val="22"/>
+        </w:rPr>
+        <w:t xml:space="preserve">Optimización de recorridos: </w:t>
+      </w:r>
+      <w:r>
+        <w:rPr>
+          <w:rFonts w:ascii="Calibri" w:hAnsi="Calibri"/>
+          <w:sz w:val="22"/>
+        </w:rPr>
+        <w:t>Optimización inteligente de recorridos y rutas de recolección</w:t>
       </w:r>
     </w:p>
     <w:p>
@@ -1756,7 +1711,7 @@
           <w:rFonts w:ascii="Calibri" w:hAnsi="Calibri"/>
           <w:sz w:val="22"/>
         </w:rPr>
-        <w:t>50% al inicio del proyecto</w:t>
+        <w:t>Pago único una vez finalizado el testing y validación completa del sistema</w:t>
       </w:r>
     </w:p>
     <w:p>
@@ -1768,7 +1723,7 @@
           <w:rFonts w:ascii="Calibri" w:hAnsi="Calibri"/>
           <w:sz w:val="22"/>
         </w:rPr>
-        <w:t>50% al finalizar y entregar Fase 1</w:t>
+        <w:t>El pago se realiza unos días antes de la entrega final</w:t>
       </w:r>
     </w:p>
     <w:p>
@@ -1791,31 +1746,7 @@
           <w:rFonts w:ascii="Calibri" w:hAnsi="Calibri"/>
           <w:sz w:val="22"/>
         </w:rPr>
-        <w:t>Pago 1: al inicio de Fase 2</w:t>
-      </w:r>
-    </w:p>
-    <w:p>
-      <w:pPr>
-        <w:pStyle w:val="ListBullet"/>
-      </w:pPr>
-      <w:r>
-        <w:rPr>
-          <w:rFonts w:ascii="Calibri" w:hAnsi="Calibri"/>
-          <w:sz w:val="22"/>
-        </w:rPr>
-        <w:t>Pago 2: al alcanzar hito intermedio (entrega parcial)</w:t>
-      </w:r>
-    </w:p>
-    <w:p>
-      <w:pPr>
-        <w:pStyle w:val="ListBullet"/>
-      </w:pPr>
-      <w:r>
-        <w:rPr>
-          <w:rFonts w:ascii="Calibri" w:hAnsi="Calibri"/>
-          <w:sz w:val="22"/>
-        </w:rPr>
-        <w:t>Pago 3: al finalizar y entregar Fase 2</w:t>
+        <w:t>Condiciones de pago a definir al inicio de la Fase 2</w:t>
       </w:r>
     </w:p>
     <w:p/>
@@ -1828,18 +1759,6 @@
           <w:color w:val="1B4F72"/>
         </w:rPr>
         <w:t>Notas Importantes</w:t>
-      </w:r>
-    </w:p>
-    <w:p>
-      <w:pPr>
-        <w:pStyle w:val="ListBullet"/>
-      </w:pPr>
-      <w:r>
-        <w:rPr>
-          <w:rFonts w:ascii="Calibri" w:hAnsi="Calibri"/>
-          <w:sz w:val="22"/>
-        </w:rPr>
-        <w:t>Los precios no incluyen IVA.</w:t>
       </w:r>
     </w:p>
     <w:p>

</xml_diff>